<commit_message>
Correct lecturer name to Vyacheslav Nepdov (נפדוב ויאצ׳לב)
Replaces the template author's name (Yakov Damatov) with the actual
course lecturer across the poster, abstract form, and project docs.

Co-Authored-By: Claude Opus 4.8 <noreply@anthropic.com>
</commit_message>
<xml_diff>
--- a/docs/Project_Abstract_Form.docx
+++ b/docs/Project_Abstract_Form.docx
@@ -1154,7 +1154,7 @@
               <w:rPr>
                 <w:b w:val="0"/>
               </w:rPr>
-              <w:t>יעקב דמטוב</w:t>
+              <w:t>נפדוב ויאצ׳לב</w:t>
             </w:r>
           </w:p>
         </w:tc>
@@ -1176,7 +1176,7 @@
               <w:rPr>
                 <w:b w:val="0"/>
               </w:rPr>
-              <w:t>Yakov Damatov</w:t>
+              <w:t>Vyacheslav Nepdov</w:t>
             </w:r>
           </w:p>
         </w:tc>

</xml_diff>